<commit_message>
creada introduccion y requisitos funcionales
</commit_message>
<xml_diff>
--- a/PROYECTO_ORTIZBLANCO_BRUNO/docu/DocumentacionProyecto_BrunoOrtizBlanco.docx
+++ b/PROYECTO_ORTIZBLANCO_BRUNO/docu/DocumentacionProyecto_BrunoOrtizBlanco.docx
@@ -347,7 +347,73 @@
               </wp:anchor>
             </w:drawing>
           </mc:Choice>
-          <mc:Fallback xmlns:a14="http://schemas.microsoft.com/office/drawing/2010/main" xmlns:pic="http://schemas.openxmlformats.org/drawingml/2006/picture" xmlns:a="http://schemas.openxmlformats.org/drawingml/2006/main"/>
+          <mc:Fallback>
+            <w:pict>
+              <v:rect w14:anchorId="6FFC4F63" id="Cuadro de texto 7" o:spid="_x0000_s1027" style="position:absolute;margin-left:407.2pt;margin-top:709.7pt;width:224.7pt;height:77.6pt;rotation:-54;z-index:251662336;visibility:visible;mso-wrap-style:square;mso-height-percent:0;mso-wrap-distance-left:9pt;mso-wrap-distance-top:0;mso-wrap-distance-right:9pt;mso-wrap-distance-bottom:0;mso-position-horizontal:absolute;mso-position-horizontal-relative:margin;mso-position-vertical:absolute;mso-position-vertical-relative:text;mso-height-percent:0;mso-height-relative:margin;v-text-anchor:top" o:gfxdata="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" filled="f" stroked="f" strokeweight=".5pt">
+                <v:textbox>
+                  <w:txbxContent>
+                    <w:p>
+                      <w:pPr>
+                        <w:spacing w:line="276" w:lineRule="auto"/>
+                        <w:jc w:val="center"/>
+                        <w:rPr>
+                          <w:rFonts w:eastAsia="Aptos" w:hAnsi="Aptos" w:cs="Aptos"/>
+                          <w:b/>
+                          <w:bCs/>
+                          <w:color w:val="FFFFFF" w:themeColor="background1"/>
+                          <w:kern w:val="0"/>
+                          <w:sz w:val="36"/>
+                          <w:szCs w:val="36"/>
+                          <w:lang w:val="en-US"/>
+                          <w14:ligatures w14:val="none"/>
+                        </w:rPr>
+                      </w:pPr>
+                      <w:r>
+                        <w:rPr>
+                          <w:rFonts w:eastAsia="Aptos" w:hAnsi="Aptos" w:cs="Aptos"/>
+                          <w:b/>
+                          <w:bCs/>
+                          <w:color w:val="FFFFFF" w:themeColor="background1"/>
+                          <w:sz w:val="36"/>
+                          <w:szCs w:val="36"/>
+                          <w:lang w:val="en-US"/>
+                        </w:rPr>
+                        <w:t>2VIFC302</w:t>
+                      </w:r>
+                    </w:p>
+                    <w:p>
+                      <w:pPr>
+                        <w:spacing w:line="276" w:lineRule="auto"/>
+                        <w:jc w:val="center"/>
+                        <w:rPr>
+                          <w:rFonts w:eastAsia="Aptos" w:hAnsi="Aptos" w:cs="Aptos"/>
+                          <w:b/>
+                          <w:bCs/>
+                          <w:color w:val="FFFFFF" w:themeColor="background1"/>
+                          <w:sz w:val="36"/>
+                          <w:szCs w:val="36"/>
+                          <w:lang w:val="en-US"/>
+                        </w:rPr>
+                      </w:pPr>
+                      <w:r>
+                        <w:rPr>
+                          <w:rFonts w:eastAsia="Aptos" w:hAnsi="Aptos" w:cs="Aptos"/>
+                          <w:b/>
+                          <w:bCs/>
+                          <w:color w:val="FFFFFF" w:themeColor="background1"/>
+                          <w:sz w:val="36"/>
+                          <w:szCs w:val="36"/>
+                          <w:lang w:val="en-US"/>
+                        </w:rPr>
+                        <w:t>CURSO 2025-2026</w:t>
+                      </w:r>
+                    </w:p>
+                  </w:txbxContent>
+                </v:textbox>
+                <w10:wrap anchorx="margin"/>
+              </v:rect>
+            </w:pict>
+          </mc:Fallback>
         </mc:AlternateContent>
       </w:r>
       <w:r>
@@ -475,29 +541,7 @@
                                 <w:sz w:val="32"/>
                                 <w:szCs w:val="32"/>
                               </w:rPr>
-                              <w:t>TUTOR</w:t>
-                            </w:r>
-                            <w:r>
-                              <w:rPr>
-                                <w:rFonts w:eastAsia="Aptos" w:hAnsi="Aptos" w:cs="Aptos"/>
-                                <w:b/>
-                                <w:bCs/>
-                                <w:color w:val="215E99" w:themeColor="text2" w:themeTint="BF"/>
-                                <w:sz w:val="32"/>
-                                <w:szCs w:val="32"/>
-                              </w:rPr>
-                              <w:t>Í</w:t>
-                            </w:r>
-                            <w:r>
-                              <w:rPr>
-                                <w:rFonts w:eastAsia="Aptos" w:hAnsi="Aptos" w:cs="Aptos"/>
-                                <w:b/>
-                                <w:bCs/>
-                                <w:color w:val="215E99" w:themeColor="text2" w:themeTint="BF"/>
-                                <w:sz w:val="32"/>
-                                <w:szCs w:val="32"/>
-                              </w:rPr>
-                              <w:t>A:</w:t>
+                              <w:t>TUTORÍA:</w:t>
                             </w:r>
                           </w:p>
                           <w:p>
@@ -718,29 +762,7 @@
                           <w:sz w:val="32"/>
                           <w:szCs w:val="32"/>
                         </w:rPr>
-                        <w:t>TUTOR</w:t>
-                      </w:r>
-                      <w:r>
-                        <w:rPr>
-                          <w:rFonts w:eastAsia="Aptos" w:hAnsi="Aptos" w:cs="Aptos"/>
-                          <w:b/>
-                          <w:bCs/>
-                          <w:color w:val="215E99" w:themeColor="text2" w:themeTint="BF"/>
-                          <w:sz w:val="32"/>
-                          <w:szCs w:val="32"/>
-                        </w:rPr>
-                        <w:t>Í</w:t>
-                      </w:r>
-                      <w:r>
-                        <w:rPr>
-                          <w:rFonts w:eastAsia="Aptos" w:hAnsi="Aptos" w:cs="Aptos"/>
-                          <w:b/>
-                          <w:bCs/>
-                          <w:color w:val="215E99" w:themeColor="text2" w:themeTint="BF"/>
-                          <w:sz w:val="32"/>
-                          <w:szCs w:val="32"/>
-                        </w:rPr>
-                        <w:t>A:</w:t>
+                        <w:t>TUTORÍA:</w:t>
                       </w:r>
                     </w:p>
                     <w:p>
@@ -980,9 +1002,9 @@
               </wp:anchor>
             </w:drawing>
           </mc:Choice>
-          <mc:Fallback xmlns:a14="http://schemas.microsoft.com/office/drawing/2010/main" xmlns:pic="http://schemas.openxmlformats.org/drawingml/2006/picture" xmlns:a="http://schemas.openxmlformats.org/drawingml/2006/main">
-            <w:pict xmlns:w14="http://schemas.microsoft.com/office/word/2010/wordml" xmlns:w="http://schemas.openxmlformats.org/wordprocessingml/2006/main" w14:anchorId="64786EBE">
-              <v:shape xmlns:o="urn:schemas-microsoft-com:office:office" xmlns:v="urn:schemas-microsoft-com:vml" id="Cuadro de texto 4" style="position:absolute;margin-left:-2.25pt;margin-top:363.7pt;width:591.35pt;height:102.05pt;z-index:251659264;visibility:visible;mso-wrap-style:square;mso-width-percent:0;mso-wrap-distance-left:9pt;mso-wrap-distance-top:0;mso-wrap-distance-right:9pt;mso-wrap-distance-bottom:0;mso-position-horizontal:absolute;mso-position-horizontal-relative:margin;mso-position-vertical:absolute;mso-position-vertical-relative:text;mso-width-percent:0;mso-width-relative:margin;v-text-anchor:top" o:spid="_x0000_s1029" filled="f" stroked="f" strokeweight=".5pt" type="#_x0000_t202" o:gfxdata="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" w14:anchorId="53393973">
+          <mc:Fallback>
+            <w:pict>
+              <v:shape w14:anchorId="1E340BF8" id="Cuadro de texto 4" o:spid="_x0000_s1029" type="#_x0000_t202" style="position:absolute;margin-left:-2.25pt;margin-top:363.7pt;width:591.35pt;height:102.05pt;z-index:251659264;visibility:visible;mso-wrap-style:square;mso-width-percent:0;mso-wrap-distance-left:9pt;mso-wrap-distance-top:0;mso-wrap-distance-right:9pt;mso-wrap-distance-bottom:0;mso-position-horizontal:absolute;mso-position-horizontal-relative:margin;mso-position-vertical:absolute;mso-position-vertical-relative:text;mso-width-percent:0;mso-width-relative:margin;v-text-anchor:top" o:gfxdata="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" filled="f" stroked="f" strokeweight=".5pt">
                 <v:textbox>
                   <w:txbxContent>
                     <w:p>
@@ -1013,7 +1035,7 @@
                     </w:p>
                   </w:txbxContent>
                 </v:textbox>
-                <w10:wrap xmlns:w10="urn:schemas-microsoft-com:office:word" anchorx="margin"/>
+                <w10:wrap anchorx="margin"/>
               </v:shape>
             </w:pict>
           </mc:Fallback>
@@ -1149,7 +1171,75 @@
               </wp:anchor>
             </w:drawing>
           </mc:Choice>
-          <mc:Fallback xmlns:a14="http://schemas.microsoft.com/office/drawing/2010/main" xmlns:pic="http://schemas.openxmlformats.org/drawingml/2006/picture" xmlns:a="http://schemas.openxmlformats.org/drawingml/2006/main"/>
+          <mc:Fallback>
+            <w:pict>
+              <v:rect w14:anchorId="3BAD7757" id="Cuadro de texto 5" o:spid="_x0000_s1030" style="position:absolute;margin-left:249.35pt;margin-top:435.35pt;width:326.3pt;height:77.3pt;z-index:251660288;visibility:visible;mso-wrap-style:square;mso-width-percent:0;mso-height-percent:0;mso-wrap-distance-left:9pt;mso-wrap-distance-top:0;mso-wrap-distance-right:9pt;mso-wrap-distance-bottom:0;mso-position-horizontal:absolute;mso-position-horizontal-relative:text;mso-position-vertical:absolute;mso-position-vertical-relative:text;mso-width-percent:0;mso-height-percent:0;mso-width-relative:margin;mso-height-relative:margin;v-text-anchor:top" o:gfxdata="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" filled="f" stroked="f" strokeweight=".5pt">
+                <v:textbox>
+                  <w:txbxContent>
+                    <w:p>
+                      <w:pPr>
+                        <w:spacing w:line="276" w:lineRule="auto"/>
+                        <w:jc w:val="right"/>
+                        <w:rPr>
+                          <w:rFonts w:eastAsia="Aptos" w:hAnsi="Aptos" w:cs="Aptos"/>
+                          <w:color w:val="215E99" w:themeColor="text2" w:themeTint="BF"/>
+                          <w:kern w:val="0"/>
+                          <w:sz w:val="44"/>
+                          <w:szCs w:val="44"/>
+                          <w:lang w:val="en-US"/>
+                          <w14:ligatures w14:val="none"/>
+                        </w:rPr>
+                      </w:pPr>
+                      <w:r>
+                        <w:rPr>
+                          <w:rFonts w:eastAsia="Aptos" w:hAnsi="Aptos" w:cs="Aptos"/>
+                          <w:color w:val="215E99" w:themeColor="text2" w:themeTint="BF"/>
+                          <w:sz w:val="44"/>
+                          <w:szCs w:val="44"/>
+                          <w:lang w:val="en-US"/>
+                        </w:rPr>
+                        <w:t xml:space="preserve">Desarrollo de </w:t>
+                      </w:r>
+                      <w:proofErr w:type="spellStart"/>
+                      <w:r>
+                        <w:rPr>
+                          <w:rFonts w:eastAsia="Aptos" w:hAnsi="Aptos" w:cs="Aptos"/>
+                          <w:color w:val="215E99" w:themeColor="text2" w:themeTint="BF"/>
+                          <w:sz w:val="44"/>
+                          <w:szCs w:val="44"/>
+                          <w:lang w:val="en-US"/>
+                        </w:rPr>
+                        <w:t>Aplicaciones</w:t>
+                      </w:r>
+                      <w:proofErr w:type="spellEnd"/>
+                      <w:r>
+                        <w:rPr>
+                          <w:rFonts w:eastAsia="Aptos" w:hAnsi="Aptos" w:cs="Aptos"/>
+                          <w:color w:val="215E99" w:themeColor="text2" w:themeTint="BF"/>
+                          <w:sz w:val="44"/>
+                          <w:szCs w:val="44"/>
+                          <w:lang w:val="en-US"/>
+                        </w:rPr>
+                        <w:t xml:space="preserve"> </w:t>
+                      </w:r>
+                      <w:proofErr w:type="spellStart"/>
+                      <w:r>
+                        <w:rPr>
+                          <w:rFonts w:eastAsia="Aptos" w:hAnsi="Aptos" w:cs="Aptos"/>
+                          <w:color w:val="215E99" w:themeColor="text2" w:themeTint="BF"/>
+                          <w:sz w:val="44"/>
+                          <w:szCs w:val="44"/>
+                          <w:lang w:val="en-US"/>
+                        </w:rPr>
+                        <w:t>Multiplataforma</w:t>
+                      </w:r>
+                      <w:proofErr w:type="spellEnd"/>
+                    </w:p>
+                  </w:txbxContent>
+                </v:textbox>
+              </v:rect>
+            </w:pict>
+          </mc:Fallback>
         </mc:AlternateContent>
       </w:r>
       <w:r>
@@ -1158,7 +1248,7 @@
           <w:lang w:eastAsia="es-VE"/>
         </w:rPr>
         <w:drawing>
-          <wp:inline distT="0" distB="0" distL="0" distR="0" wp14:anchorId="7F7E7601" wp14:editId="1E9F6E42">
+          <wp:inline distT="0" distB="0" distL="0" distR="0" wp14:anchorId="7F7E7601" wp14:editId="06DDD92B">
             <wp:extent cx="7556500" cy="10599420"/>
             <wp:effectExtent l="0" t="0" r="6350" b="0"/>
             <wp:docPr id="2" name="Imagen 2" descr="D:\servicios forobeta posts\diseño grafico\CLIENTES\Feelmusic - 05.11.18\archivos\11\11.jpg"/>
@@ -4501,6 +4591,9 @@
       <w:bookmarkEnd w:id="0"/>
     </w:p>
     <w:p>
+      <w:pPr>
+        <w:jc w:val="both"/>
+      </w:pPr>
       <w:r>
         <w:t xml:space="preserve">El presente documento corresponde a la documentación del Proyecto </w:t>
       </w:r>
@@ -4510,7 +4603,34 @@
       </w:r>
       <w:proofErr w:type="spellEnd"/>
       <w:r>
-        <w:t xml:space="preserve"> del CFGS en Técnico Superior de Desarrollo de Aplicaciones Multiplataforma (…)</w:t>
+        <w:t xml:space="preserve"> del CFGS en Técnico Superior de Desarrollo de Aplicaciones Multiplataforma</w:t>
+      </w:r>
+      <w:r>
+        <w:t xml:space="preserve">, para el curso 2025-2026 en el CIFP La Laboral de Gijón. Este proyecto, identificado como Proyecto </w:t>
+      </w:r>
+      <w:proofErr w:type="spellStart"/>
+      <w:r>
+        <w:t>Intermodular</w:t>
+      </w:r>
+      <w:proofErr w:type="spellEnd"/>
+      <w:r>
+        <w:t xml:space="preserve"> II – 2º DAM, tiene como objetivo principal el desarrollo completo de un aplicativo diseñado específicamente para la gestión de las formaciones en empresa de los módulos profesionales de los en el departamento de </w:t>
+      </w:r>
+      <w:proofErr w:type="spellStart"/>
+      <w:r>
+        <w:t>Informatica</w:t>
+      </w:r>
+      <w:proofErr w:type="spellEnd"/>
+      <w:r>
+        <w:t xml:space="preserve"> y Comunicaciones del centro. El proyecto requiere la implementación de un producto cerrado, plenamente funciona y totalmente documentado, que debe responder a las necesidades principales de la gestión de las formaciones en empresa e incorporar conocimientos adquiridos a lo largo de todo el ciclo formativo.</w:t>
+      </w:r>
+    </w:p>
+    <w:p>
+      <w:pPr>
+        <w:jc w:val="both"/>
+      </w:pPr>
+      <w:r>
+        <w:t>…</w:t>
       </w:r>
     </w:p>
     <w:p>
@@ -4529,7 +4649,46 @@
     </w:p>
     <w:p>
       <w:r>
-        <w:t>En este apartado se describen los objetivos del proyecto (…)</w:t>
+        <w:t xml:space="preserve">El propósito central del proyecto </w:t>
+      </w:r>
+      <w:proofErr w:type="spellStart"/>
+      <w:r>
+        <w:t>intermodular</w:t>
+      </w:r>
+      <w:proofErr w:type="spellEnd"/>
+      <w:r>
+        <w:t xml:space="preserve"> es el desarrollo completo de un aplicativo cuyo destino principal es la gestión de las formaciones en empresa. Este aplicativo está diseñado específicamente para abordar la administración de los módulos profesionales de los ciclos que pertenecen al departamento de Informática y Comunicaciones del centro educativo. </w:t>
+      </w:r>
+    </w:p>
+    <w:p>
+      <w:r>
+        <w:t>El objetivo final es la implementación de un producto cerrado, que sea plenamente funcional y esté totalmente documentado.</w:t>
+      </w:r>
+    </w:p>
+    <w:p>
+      <w:r>
+        <w:t>Respecto al alcance de este proyecto, no se busca desarrollar un producto que contenga la totalidad de</w:t>
+      </w:r>
+      <w:r>
+        <w:t xml:space="preserve"> las funcionalidades posibles relacionadas con las formaciones en empresa. En su lugar, el aplicativo debe responder a las necesidades principales para la gestión de estas formaciones dentro del departamento. Esto incluye la gestión de elementos clave, tales como usuarios con sus diferentes perfiles, así como el manejo y la disposición de la documentación asociada a cada formación.</w:t>
+      </w:r>
+    </w:p>
+    <w:p>
+      <w:r>
+        <w:t>Desde una perspectiva educativa, el proyecto también tiene el objetivo de aglutinar y aplicar una gran parte de los conocimientos adquiridos en los distintos módulos del ciclo formativo, incluyendo tanto aspectos del primer curso como del segundo curso.</w:t>
+      </w:r>
+    </w:p>
+    <w:p>
+      <w:r>
+        <w:t>Los siguientes apartados desarrollarán con mayor detalle el objetivo general del proyecto</w:t>
+      </w:r>
+      <w:r>
+        <w:t>…</w:t>
+      </w:r>
+    </w:p>
+    <w:p>
+      <w:r>
+        <w:t>…</w:t>
       </w:r>
     </w:p>
     <w:p>
@@ -4637,11 +4796,102 @@
       </w:r>
       <w:bookmarkEnd w:id="10"/>
     </w:p>
-    <w:p>
-      <w:r>
-        <w:t>(…)</w:t>
-      </w:r>
-    </w:p>
+    <w:tbl>
+      <w:tblPr>
+        <w:tblStyle w:val="Tablaconcuadrcula"/>
+        <w:tblW w:w="0" w:type="auto"/>
+        <w:tblLook w:val="04A0" w:firstRow="1" w:lastRow="0" w:firstColumn="1" w:lastColumn="0" w:noHBand="0" w:noVBand="1"/>
+      </w:tblPr>
+      <w:tblGrid>
+        <w:gridCol w:w="704"/>
+        <w:gridCol w:w="5714"/>
+        <w:gridCol w:w="3210"/>
+      </w:tblGrid>
+      <w:tr>
+        <w:tc>
+          <w:tcPr>
+            <w:tcW w:w="704" w:type="dxa"/>
+          </w:tcPr>
+          <w:p>
+            <w:r>
+              <w:t>ID</w:t>
+            </w:r>
+          </w:p>
+        </w:tc>
+        <w:tc>
+          <w:tcPr>
+            <w:tcW w:w="5714" w:type="dxa"/>
+          </w:tcPr>
+          <w:p>
+            <w:r>
+              <w:t>Descripción del Requisito Funcional</w:t>
+            </w:r>
+          </w:p>
+        </w:tc>
+        <w:tc>
+          <w:tcPr>
+            <w:tcW w:w="3210" w:type="dxa"/>
+          </w:tcPr>
+          <w:p>
+            <w:r>
+              <w:t>Perfiles</w:t>
+            </w:r>
+          </w:p>
+        </w:tc>
+      </w:tr>
+      <w:tr>
+        <w:tc>
+          <w:tcPr>
+            <w:tcW w:w="704" w:type="dxa"/>
+          </w:tcPr>
+          <w:p>
+            <w:r>
+              <w:t>RF1</w:t>
+            </w:r>
+          </w:p>
+        </w:tc>
+        <w:tc>
+          <w:tcPr>
+            <w:tcW w:w="5714" w:type="dxa"/>
+          </w:tcPr>
+          <w:p>
+            <w:r>
+              <w:rPr>
+                <w:b/>
+                <w:bCs/>
+              </w:rPr>
+              <w:t>Autenticación de Usuarios</w:t>
+            </w:r>
+            <w:r>
+              <w:rPr>
+                <w:b/>
+                <w:bCs/>
+              </w:rPr>
+              <w:t xml:space="preserve">: </w:t>
+            </w:r>
+            <w:r>
+              <w:t xml:space="preserve">El sistema deberá permitir que los usuarios se autentiquen utilizando credenciales </w:t>
+            </w:r>
+            <w:r>
+              <w:lastRenderedPageBreak/>
+              <w:t>de acceso, permitiendo el acceso con el perfil concreto correspondiente</w:t>
+            </w:r>
+          </w:p>
+        </w:tc>
+        <w:tc>
+          <w:tcPr>
+            <w:tcW w:w="3210" w:type="dxa"/>
+          </w:tcPr>
+          <w:p>
+            <w:r>
+              <w:lastRenderedPageBreak/>
+              <w:t>Todos los perfiles</w:t>
+            </w:r>
+          </w:p>
+        </w:tc>
+      </w:tr>
+    </w:tbl>
+    <w:p/>
     <w:p>
       <w:pPr>
         <w:pStyle w:val="Ttulo2"/>
@@ -4868,7 +5118,6 @@
         <w:rPr>
           <w:noProof/>
         </w:rPr>
-        <w:lastRenderedPageBreak/>
         <w:drawing>
           <wp:inline distT="0" distB="0" distL="0" distR="0" wp14:anchorId="14E7D401" wp14:editId="50AD29B2">
             <wp:extent cx="472440" cy="670560"/>
@@ -5057,6 +5306,7 @@
       </w:pPr>
       <w:bookmarkStart w:id="22" w:name="_Toc210125381"/>
       <w:r>
+        <w:lastRenderedPageBreak/>
         <w:t>INTERFACES GRÁFICAS DE USUARIO</w:t>
       </w:r>
       <w:bookmarkEnd w:id="22"/>
@@ -5363,7 +5613,6 @@
       </w:pPr>
       <w:bookmarkStart w:id="48" w:name="_Toc210125395"/>
       <w:r>
-        <w:lastRenderedPageBreak/>
         <w:t>RELACIÓN CON LOS MÓDULOS DEL CICLO</w:t>
       </w:r>
       <w:bookmarkEnd w:id="48"/>
@@ -6811,7 +7060,6 @@
   <w:style w:type="character" w:default="1" w:styleId="Fuentedeprrafopredeter">
     <w:name w:val="Default Paragraph Font"/>
     <w:uiPriority w:val="1"/>
-    <w:semiHidden/>
     <w:unhideWhenUsed/>
   </w:style>
   <w:style w:type="table" w:default="1" w:styleId="Tablanormal">
@@ -7242,6 +7490,25 @@
       <w:spacing w:after="0"/>
     </w:pPr>
   </w:style>
+  <w:style w:type="table" w:styleId="Tablaconcuadrcula">
+    <w:name w:val="Table Grid"/>
+    <w:basedOn w:val="Tablanormal"/>
+    <w:uiPriority w:val="39"/>
+    <w:rsid w:val="00BA78CA"/>
+    <w:pPr>
+      <w:spacing w:after="0" w:line="240" w:lineRule="auto"/>
+    </w:pPr>
+    <w:tblPr>
+      <w:tblBorders>
+        <w:top w:val="single" w:sz="4" w:space="0" w:color="auto"/>
+        <w:left w:val="single" w:sz="4" w:space="0" w:color="auto"/>
+        <w:bottom w:val="single" w:sz="4" w:space="0" w:color="auto"/>
+        <w:right w:val="single" w:sz="4" w:space="0" w:color="auto"/>
+        <w:insideH w:val="single" w:sz="4" w:space="0" w:color="auto"/>
+        <w:insideV w:val="single" w:sz="4" w:space="0" w:color="auto"/>
+      </w:tblBorders>
+    </w:tblPr>
+  </w:style>
 </w:styles>
 </file>
 
@@ -7547,12 +7814,7 @@
 </file>
 
 <file path=customXml/item2.xml><?xml version="1.0" encoding="utf-8"?>
-<?mso-contentType ?>
-<FormTemplates xmlns="http://schemas.microsoft.com/sharepoint/v3/contenttype/forms">
-  <Display>DocumentLibraryForm</Display>
-  <Edit>DocumentLibraryForm</Edit>
-  <New>DocumentLibraryForm</New>
-</FormTemplates>
+<b:Sources xmlns:b="http://schemas.openxmlformats.org/officeDocument/2006/bibliography" xmlns="http://schemas.openxmlformats.org/officeDocument/2006/bibliography" SelectedStyle="\APASixthEditionOfficeOnline.xsl" StyleName="APA" Version="6"/>
 </file>
 
 <file path=customXml/item3.xml><?xml version="1.0" encoding="utf-8"?>
@@ -7694,7 +7956,12 @@
 </file>
 
 <file path=customXml/item4.xml><?xml version="1.0" encoding="utf-8"?>
-<b:Sources xmlns:b="http://schemas.openxmlformats.org/officeDocument/2006/bibliography" xmlns="http://schemas.openxmlformats.org/officeDocument/2006/bibliography" SelectedStyle="\APASixthEditionOfficeOnline.xsl" StyleName="APA" Version="6"/>
+<?mso-contentType ?>
+<FormTemplates xmlns="http://schemas.microsoft.com/sharepoint/v3/contenttype/forms">
+  <Display>DocumentLibraryForm</Display>
+  <Edit>DocumentLibraryForm</Edit>
+  <New>DocumentLibraryForm</New>
+</FormTemplates>
 </file>
 
 <file path=customXml/itemProps1.xml><?xml version="1.0" encoding="utf-8"?>
@@ -7707,9 +7974,9 @@
 </file>
 
 <file path=customXml/itemProps2.xml><?xml version="1.0" encoding="utf-8"?>
-<ds:datastoreItem xmlns:ds="http://schemas.openxmlformats.org/officeDocument/2006/customXml" ds:itemID="{480B8420-1B48-4D23-8D6E-64373AC5070B}">
+<ds:datastoreItem xmlns:ds="http://schemas.openxmlformats.org/officeDocument/2006/customXml" ds:itemID="{453714F8-FBC3-4DCC-8DCB-89BB58DCF76F}">
   <ds:schemaRefs>
-    <ds:schemaRef ds:uri="http://schemas.microsoft.com/sharepoint/v3/contenttype/forms"/>
+    <ds:schemaRef ds:uri="http://schemas.openxmlformats.org/officeDocument/2006/bibliography"/>
   </ds:schemaRefs>
 </ds:datastoreItem>
 </file>
@@ -7733,9 +8000,9 @@
 </file>
 
 <file path=customXml/itemProps4.xml><?xml version="1.0" encoding="utf-8"?>
-<ds:datastoreItem xmlns:ds="http://schemas.openxmlformats.org/officeDocument/2006/customXml" ds:itemID="{453714F8-FBC3-4DCC-8DCB-89BB58DCF76F}">
+<ds:datastoreItem xmlns:ds="http://schemas.openxmlformats.org/officeDocument/2006/customXml" ds:itemID="{480B8420-1B48-4D23-8D6E-64373AC5070B}">
   <ds:schemaRefs>
-    <ds:schemaRef ds:uri="http://schemas.openxmlformats.org/officeDocument/2006/bibliography"/>
+    <ds:schemaRef ds:uri="http://schemas.microsoft.com/sharepoint/v3/contenttype/forms"/>
   </ds:schemaRefs>
 </ds:datastoreItem>
 </file>
</xml_diff>

<commit_message>
agregado mapa de navegabilidad
</commit_message>
<xml_diff>
--- a/PROYECTO_ORTIZBLANCO_BRUNO/docu/DocumentacionProyecto_BrunoOrtizBlanco.docx
+++ b/PROYECTO_ORTIZBLANCO_BRUNO/docu/DocumentacionProyecto_BrunoOrtizBlanco.docx
@@ -565,18 +565,7 @@
                                 <w:sz w:val="32"/>
                                 <w:szCs w:val="32"/>
                               </w:rPr>
-                              <w:t xml:space="preserve">Luis de Blas </w:t>
-                            </w:r>
-                            <w:r>
-                              <w:rPr>
-                                <w:rFonts w:eastAsia="Aptos" w:hAnsi="Aptos" w:cs="Aptos"/>
-                                <w:b/>
-                                <w:bCs/>
-                                <w:color w:val="215E99" w:themeColor="text2" w:themeTint="BF"/>
-                                <w:sz w:val="32"/>
-                                <w:szCs w:val="32"/>
-                              </w:rPr>
-                              <w:t>Blazquez</w:t>
+                              <w:t>Luis de Blas Blazquez</w:t>
                             </w:r>
                           </w:p>
                           <w:p>
@@ -784,18 +773,7 @@
                           <w:sz w:val="32"/>
                           <w:szCs w:val="32"/>
                         </w:rPr>
-                        <w:t xml:space="preserve">Luis de Blas </w:t>
-                      </w:r>
-                      <w:r>
-                        <w:rPr>
-                          <w:rFonts w:eastAsia="Aptos" w:hAnsi="Aptos" w:cs="Aptos"/>
-                          <w:b/>
-                          <w:bCs/>
-                          <w:color w:val="215E99" w:themeColor="text2" w:themeTint="BF"/>
-                          <w:sz w:val="32"/>
-                          <w:szCs w:val="32"/>
-                        </w:rPr>
-                        <w:t>Blazquez</w:t>
+                        <w:t>Luis de Blas Blazquez</w:t>
                       </w:r>
                     </w:p>
                     <w:p>
@@ -1113,17 +1091,7 @@
                                 <w:szCs w:val="44"/>
                                 <w:lang w:val="en-US"/>
                               </w:rPr>
-                              <w:t xml:space="preserve">Desarrollo de </w:t>
-                            </w:r>
-                            <w:r>
-                              <w:rPr>
-                                <w:rFonts w:eastAsia="Aptos" w:hAnsi="Aptos" w:cs="Aptos"/>
-                                <w:color w:val="215E99" w:themeColor="text2" w:themeTint="BF"/>
-                                <w:sz w:val="44"/>
-                                <w:szCs w:val="44"/>
-                                <w:lang w:val="en-US"/>
-                              </w:rPr>
-                              <w:t>Aplicaciones Multiplataforma</w:t>
+                              <w:t>Desarrollo de Aplicaciones Multiplataforma</w:t>
                             </w:r>
                           </w:p>
                         </w:txbxContent>
@@ -1170,17 +1138,7 @@
                           <w:szCs w:val="44"/>
                           <w:lang w:val="en-US"/>
                         </w:rPr>
-                        <w:t xml:space="preserve">Desarrollo de </w:t>
-                      </w:r>
-                      <w:r>
-                        <w:rPr>
-                          <w:rFonts w:eastAsia="Aptos" w:hAnsi="Aptos" w:cs="Aptos"/>
-                          <w:color w:val="215E99" w:themeColor="text2" w:themeTint="BF"/>
-                          <w:sz w:val="44"/>
-                          <w:szCs w:val="44"/>
-                          <w:lang w:val="en-US"/>
-                        </w:rPr>
-                        <w:t>Aplicaciones Multiplataforma</w:t>
+                        <w:t>Desarrollo de Aplicaciones Multiplataforma</w:t>
                       </w:r>
                     </w:p>
                   </w:txbxContent>
@@ -1196,7 +1154,7 @@
           <w:lang w:eastAsia="es-VE"/>
         </w:rPr>
         <w:drawing>
-          <wp:inline distT="0" distB="0" distL="0" distR="0" wp14:anchorId="7F7E7601" wp14:editId="23C75E2C">
+          <wp:inline distT="0" distB="0" distL="0" distR="0" wp14:anchorId="7F7E7601" wp14:editId="64900264">
             <wp:extent cx="7556500" cy="10599420"/>
             <wp:effectExtent l="0" t="0" r="6350" b="0"/>
             <wp:docPr id="2" name="Imagen 2" descr="D:\servicios forobeta posts\diseño grafico\CLIENTES\Feelmusic - 05.11.18\archivos\11\11.jpg"/>
@@ -2575,7 +2533,7 @@
                 <w:noProof/>
                 <w:webHidden/>
               </w:rPr>
-              <w:t>9</w:t>
+              <w:t>10</w:t>
             </w:r>
             <w:r>
               <w:rPr>
@@ -2667,7 +2625,7 @@
                 <w:noProof/>
                 <w:webHidden/>
               </w:rPr>
-              <w:t>9</w:t>
+              <w:t>11</w:t>
             </w:r>
             <w:r>
               <w:rPr>
@@ -2759,7 +2717,7 @@
                 <w:noProof/>
                 <w:webHidden/>
               </w:rPr>
-              <w:t>9</w:t>
+              <w:t>12</w:t>
             </w:r>
             <w:r>
               <w:rPr>
@@ -2850,7 +2808,7 @@
                 <w:noProof/>
                 <w:webHidden/>
               </w:rPr>
-              <w:t>9</w:t>
+              <w:t>12</w:t>
             </w:r>
             <w:r>
               <w:rPr>
@@ -2940,7 +2898,7 @@
                 <w:noProof/>
                 <w:webHidden/>
               </w:rPr>
-              <w:t>9</w:t>
+              <w:t>12</w:t>
             </w:r>
             <w:r>
               <w:rPr>
@@ -3030,7 +2988,7 @@
                 <w:noProof/>
                 <w:webHidden/>
               </w:rPr>
-              <w:t>9</w:t>
+              <w:t>12</w:t>
             </w:r>
             <w:r>
               <w:rPr>
@@ -3121,7 +3079,7 @@
                 <w:noProof/>
                 <w:webHidden/>
               </w:rPr>
-              <w:t>9</w:t>
+              <w:t>12</w:t>
             </w:r>
             <w:r>
               <w:rPr>
@@ -3213,7 +3171,7 @@
                 <w:noProof/>
                 <w:webHidden/>
               </w:rPr>
-              <w:t>10</w:t>
+              <w:t>12</w:t>
             </w:r>
             <w:r>
               <w:rPr>
@@ -3304,7 +3262,7 @@
                 <w:noProof/>
                 <w:webHidden/>
               </w:rPr>
-              <w:t>10</w:t>
+              <w:t>12</w:t>
             </w:r>
             <w:r>
               <w:rPr>
@@ -3395,7 +3353,7 @@
                 <w:noProof/>
                 <w:webHidden/>
               </w:rPr>
-              <w:t>10</w:t>
+              <w:t>13</w:t>
             </w:r>
             <w:r>
               <w:rPr>
@@ -3487,7 +3445,7 @@
                 <w:noProof/>
                 <w:webHidden/>
               </w:rPr>
-              <w:t>10</w:t>
+              <w:t>13</w:t>
             </w:r>
             <w:r>
               <w:rPr>
@@ -3578,7 +3536,7 @@
                 <w:noProof/>
                 <w:webHidden/>
               </w:rPr>
-              <w:t>10</w:t>
+              <w:t>13</w:t>
             </w:r>
             <w:r>
               <w:rPr>
@@ -3668,7 +3626,7 @@
                 <w:noProof/>
                 <w:webHidden/>
               </w:rPr>
-              <w:t>10</w:t>
+              <w:t>13</w:t>
             </w:r>
             <w:r>
               <w:rPr>
@@ -3758,7 +3716,7 @@
                 <w:noProof/>
                 <w:webHidden/>
               </w:rPr>
-              <w:t>10</w:t>
+              <w:t>13</w:t>
             </w:r>
             <w:r>
               <w:rPr>
@@ -3849,7 +3807,7 @@
                 <w:noProof/>
                 <w:webHidden/>
               </w:rPr>
-              <w:t>10</w:t>
+              <w:t>13</w:t>
             </w:r>
             <w:r>
               <w:rPr>
@@ -3940,7 +3898,7 @@
                 <w:noProof/>
                 <w:webHidden/>
               </w:rPr>
-              <w:t>10</w:t>
+              <w:t>13</w:t>
             </w:r>
             <w:r>
               <w:rPr>
@@ -4031,7 +3989,7 @@
                 <w:noProof/>
                 <w:webHidden/>
               </w:rPr>
-              <w:t>10</w:t>
+              <w:t>13</w:t>
             </w:r>
             <w:r>
               <w:rPr>
@@ -4123,7 +4081,7 @@
                 <w:noProof/>
                 <w:webHidden/>
               </w:rPr>
-              <w:t>10</w:t>
+              <w:t>13</w:t>
             </w:r>
             <w:r>
               <w:rPr>
@@ -4214,7 +4172,7 @@
                 <w:noProof/>
                 <w:webHidden/>
               </w:rPr>
-              <w:t>10</w:t>
+              <w:t>13</w:t>
             </w:r>
             <w:r>
               <w:rPr>
@@ -4497,7 +4455,7 @@
             <w:noProof/>
             <w:webHidden/>
           </w:rPr>
-          <w:t>9</w:t>
+          <w:t>10</w:t>
         </w:r>
         <w:r>
           <w:rPr>
@@ -4513,7 +4471,6 @@
         <w:fldChar w:fldCharType="end"/>
       </w:r>
     </w:p>
-    <w:p/>
     <w:p>
       <w:pPr>
         <w:rPr>
@@ -4662,6 +4619,9 @@
       <w:bookmarkEnd w:id="2"/>
     </w:p>
     <w:p>
+      <w:pPr>
+        <w:jc w:val="both"/>
+      </w:pPr>
       <w:bookmarkStart w:id="3" w:name="_Hlk210124417"/>
       <w:r>
         <w:t xml:space="preserve">El objetivo general de este proyecto </w:t>
@@ -4679,11 +4639,17 @@
       </w:r>
     </w:p>
     <w:p>
+      <w:pPr>
+        <w:jc w:val="both"/>
+      </w:pPr>
       <w:r>
         <w:t>Con este trabajo busco aplicar de forma práctica los conocimientos adquiridos a lo largo del ciclo de Desarrollo de Aplicaciones Multiplataforma, integrando aspectos de diferentes módulos tanto del primer como del segundo curso. El resultado final será un producto cerrado, plenamente operativo y correctamente documentado, que facilite la administración de usuarios con distintos perfiles y el manejo de la documentación relacionada con las formaciones.</w:t>
       </w:r>
     </w:p>
     <w:p>
+      <w:pPr>
+        <w:jc w:val="both"/>
+      </w:pPr>
       <w:r>
         <w:t>El proyecto también tiene un enfoque de aprendizaje, ya que su desarrollo me permitirá poner en práctica las competencias técnicas y organizativas para planificar, diseñar, implementar y presentar una aplicación profesional orientada a una necesidad real dentro del entorno educativo.</w:t>
       </w:r>
@@ -4705,46 +4671,73 @@
       <w:bookmarkEnd w:id="4"/>
     </w:p>
     <w:p>
+      <w:pPr>
+        <w:jc w:val="both"/>
+      </w:pPr>
       <w:r>
         <w:t>Para lograr el objetivo general, se planean los siguientes objetivos específicos:</w:t>
       </w:r>
     </w:p>
     <w:p>
+      <w:pPr>
+        <w:jc w:val="both"/>
+      </w:pPr>
       <w:r>
         <w:t>1.Diseñar la estructura general del aplicativo</w:t>
       </w:r>
     </w:p>
     <w:p>
+      <w:pPr>
+        <w:jc w:val="both"/>
+      </w:pPr>
       <w:r>
         <w:t>2.Implementar un sistema de autenticación de usuarios</w:t>
       </w:r>
     </w:p>
     <w:p>
+      <w:pPr>
+        <w:jc w:val="both"/>
+      </w:pPr>
       <w:r>
         <w:t>3.Desarrollar las funcionalidades básicas de gestión</w:t>
       </w:r>
     </w:p>
     <w:p>
+      <w:pPr>
+        <w:jc w:val="both"/>
+      </w:pPr>
       <w:r>
         <w:t>4.Incorporar un sistema de almacenamiento y gestión de documentos</w:t>
       </w:r>
     </w:p>
     <w:p>
+      <w:pPr>
+        <w:jc w:val="both"/>
+      </w:pPr>
       <w:r>
         <w:t>5.Diseñar interfaces graficas intuitivas y funcionales</w:t>
       </w:r>
     </w:p>
     <w:p>
+      <w:pPr>
+        <w:jc w:val="both"/>
+      </w:pPr>
       <w:r>
         <w:t>6.Integrar un conjunto de funcionalidades adicionales propias</w:t>
       </w:r>
     </w:p>
     <w:p>
+      <w:pPr>
+        <w:jc w:val="both"/>
+      </w:pPr>
       <w:r>
         <w:t>7.Aplicar metodologías de desarrollo adecuadas</w:t>
       </w:r>
     </w:p>
     <w:p>
+      <w:pPr>
+        <w:jc w:val="both"/>
+      </w:pPr>
       <w:r>
         <w:t>8.Elaborar toda la documentación del proyecto</w:t>
       </w:r>
@@ -4765,16 +4758,25 @@
       <w:bookmarkEnd w:id="5"/>
     </w:p>
     <w:p>
+      <w:pPr>
+        <w:jc w:val="both"/>
+      </w:pPr>
       <w:r>
         <w:t>En este apartado se presenta el proceso de análisis y diseño del aplicativo desarrollado para la gestión de las formaciones en empresa. Su objetivo es definir con claridad qué funcionalidades debe ofrecer el sistema, cómo debe comportarse y de qué manera se estructuran sus componentes internos y externos.</w:t>
       </w:r>
     </w:p>
     <w:p>
+      <w:pPr>
+        <w:jc w:val="both"/>
+      </w:pPr>
       <w:r>
         <w:t>El análisis se centra en identificar los requisitos funcionales y no funcionales del proyecto, describiendo las necesidades principales que debe cubrir la aplicación y las condiciones que debe cumplir para garantizar su correcto funcionamiento. A partir de esta información, se elaboran los casos de uso que representan las interacciones entre los distintos tipos de usuarios y el sistema, acompañados de sus respectivos diagramas.</w:t>
       </w:r>
     </w:p>
     <w:p>
+      <w:pPr>
+        <w:jc w:val="both"/>
+      </w:pPr>
       <w:r>
         <w:t>Posteriormente, en la fase de diseño, se definen los modelos de datos que servirán de base para la estructura de la aplicación, incluyendo los diagramas entidad-relación y de clases, donde se muestran las entidades, sus atributos y la relaciones entre ellas. Finalmente, se presentan las interfaces graficas de usuarios, junto con su mapa de navegabilidad, que refleja como el usuario interactúa con el sistema y como se organiza la navegación entre las diferentes vistas.</w:t>
       </w:r>
@@ -5601,6 +5603,9 @@
       <w:bookmarkEnd w:id="12"/>
     </w:p>
     <w:p>
+      <w:pPr>
+        <w:jc w:val="both"/>
+      </w:pPr>
       <w:r>
         <w:t>Los casos de uso definen las funcionalidades que el aplicativo debe ofrecer para gestionar las formaciones en empresa de los ciclos formativos del departamento de informática. Su finalidad es identificar</w:t>
       </w:r>
@@ -5609,6 +5614,9 @@
       </w:r>
     </w:p>
     <w:p>
+      <w:pPr>
+        <w:jc w:val="both"/>
+      </w:pPr>
       <w:r>
         <w:lastRenderedPageBreak/>
         <w:t>Cada caso de uso describe una unidad de comportamiento observable, es decir, una acción o conjunto de acciones que el sistema realiza en respuesta a una solicitud de un actor externo. La representación grafica de los casos de uso, a través de un diagrama UML, facilita la compresión global del sistema y ayuda a establecer los límites entre las responsabilidades del sistema y las de los actores implicados.</w:t>
@@ -5713,7 +5721,10 @@
       </w:r>
       <w:bookmarkEnd w:id="14"/>
       <w:r>
-        <w:t>Primero modelo de Casos de Uso</w:t>
+        <w:t>M</w:t>
+      </w:r>
+      <w:r>
+        <w:t>odelo de Casos de Uso</w:t>
       </w:r>
     </w:p>
     <w:p>
@@ -5731,26 +5742,41 @@
       <w:bookmarkEnd w:id="15"/>
     </w:p>
     <w:p>
+      <w:pPr>
+        <w:jc w:val="both"/>
+      </w:pPr>
       <w:r>
         <w:t>Administrador: Usuario único con todos los permisos</w:t>
       </w:r>
     </w:p>
     <w:p>
+      <w:pPr>
+        <w:jc w:val="both"/>
+      </w:pPr>
       <w:r>
         <w:t>Profesor (Coordinador): Gestiona asignaciones de estudiantes, grupos, módulos y documentación asociada.</w:t>
       </w:r>
     </w:p>
     <w:p>
+      <w:pPr>
+        <w:jc w:val="both"/>
+      </w:pPr>
       <w:r>
         <w:t>Tutor de Empresa: Tutor responsable en la empresa que valora e informa sobre el estudiante</w:t>
       </w:r>
     </w:p>
     <w:p>
+      <w:pPr>
+        <w:jc w:val="both"/>
+      </w:pPr>
       <w:r>
         <w:t>Estudiante: consulta su formación, accede a la documentación y recibe notificaciones.</w:t>
       </w:r>
     </w:p>
     <w:p>
+      <w:pPr>
+        <w:jc w:val="both"/>
+      </w:pPr>
       <w:r>
         <w:t xml:space="preserve">Invitado: actor del sistema que representa el sistema de </w:t>
       </w:r>
@@ -5779,6 +5805,9 @@
       <w:bookmarkEnd w:id="16"/>
     </w:p>
     <w:p>
+      <w:pPr>
+        <w:jc w:val="both"/>
+      </w:pPr>
       <w:r>
         <w:t xml:space="preserve">CU1: </w:t>
       </w:r>
@@ -5792,36 +5821,57 @@
       </w:r>
     </w:p>
     <w:p>
+      <w:pPr>
+        <w:jc w:val="both"/>
+      </w:pPr>
       <w:r>
         <w:t>CU2: Gestionar Usuarios y Perfiles. El administrador puede crear, editar, eliminar y asignar perfiles a los usuarios registrados en el sistema. RF5 y RF11</w:t>
       </w:r>
     </w:p>
     <w:p>
+      <w:pPr>
+        <w:jc w:val="both"/>
+      </w:pPr>
       <w:r>
         <w:t>CU3: Gestionar Formación en Empresa. Permite gestionar la información de las formaciones en empresa, los cursos asociados y los periodos académicos. RF3 y RF4</w:t>
       </w:r>
     </w:p>
     <w:p>
+      <w:pPr>
+        <w:jc w:val="both"/>
+      </w:pPr>
       <w:r>
         <w:t>CU4: Gestionar Asignaciones Estudiantes. Permite registrar y asignar a cada estudiante una empresa y un tutor correspondiente. RF7 y RF12</w:t>
       </w:r>
     </w:p>
     <w:p>
+      <w:pPr>
+        <w:jc w:val="both"/>
+      </w:pPr>
       <w:r>
         <w:t>CU5: Gestionar Documentación. Permite almacenar, consultar y administrar la documentación asociada a las formaciones y es accesible de distinta forma según el perfil de usuario. RF6</w:t>
       </w:r>
     </w:p>
     <w:p>
+      <w:pPr>
+        <w:jc w:val="both"/>
+      </w:pPr>
       <w:r>
         <w:t>CU6: Evaluar y Supervisar Estudiantes. Permite al tutor de empresa registrar observaciones, evaluaciones y seguimientos de los estudiantes durante su formación. RF8</w:t>
       </w:r>
     </w:p>
     <w:p>
+      <w:pPr>
+        <w:jc w:val="both"/>
+      </w:pPr>
       <w:r>
         <w:t>CU7: Consultar Información Personal y de Formación. Permite al estudiante acceder a su información personal, formación en empresa y documentación asociada. RF9</w:t>
       </w:r>
     </w:p>
     <w:p>
+      <w:pPr>
+        <w:jc w:val="both"/>
+      </w:pPr>
       <w:r>
         <w:t>CU8: Gestionar Informes. Permite generar informes de seguimiento y resultados de las formaciones por curso académico. RF13</w:t>
       </w:r>
@@ -5998,6 +6048,31 @@
     </w:p>
     <w:p>
       <w:pPr>
+        <w:pStyle w:val="Descripcin"/>
+        <w:jc w:val="center"/>
+      </w:pPr>
+      <w:r>
+        <w:t xml:space="preserve">Figura </w:t>
+      </w:r>
+      <w:r>
+        <w:t>3</w:t>
+      </w:r>
+      <w:r>
+        <w:t>. Diagrama Entidad Relaci</w:t>
+      </w:r>
+      <w:r>
+        <w:t>ó</w:t>
+      </w:r>
+      <w:r>
+        <w:t>n</w:t>
+      </w:r>
+      <w:r>
+        <w:t xml:space="preserve"> con atributos fundamentales</w:t>
+      </w:r>
+    </w:p>
+    <w:p/>
+    <w:p>
+      <w:pPr>
         <w:pStyle w:val="Ttulo2"/>
         <w:numPr>
           <w:ilvl w:val="2"/>
@@ -6073,22 +6148,7 @@
         <w:t xml:space="preserve">Figura </w:t>
       </w:r>
       <w:r>
-        <w:fldChar w:fldCharType="begin"/>
-      </w:r>
-      <w:r>
-        <w:instrText>SEQ Figura \* ARABIC</w:instrText>
-      </w:r>
-      <w:r>
-        <w:fldChar w:fldCharType="separate"/>
-      </w:r>
-      <w:r>
-        <w:rPr>
-          <w:noProof/>
-        </w:rPr>
-        <w:t>3</w:t>
-      </w:r>
-      <w:r>
-        <w:fldChar w:fldCharType="end"/>
+        <w:t>4</w:t>
       </w:r>
       <w:r>
         <w:t xml:space="preserve">. </w:t>
@@ -6108,9 +6168,67 @@
       </w:pPr>
       <w:bookmarkStart w:id="22" w:name="_Toc210125381"/>
       <w:r>
+        <w:lastRenderedPageBreak/>
         <w:t>INTERFACES GRÁFICAS DE USUARIO</w:t>
       </w:r>
       <w:bookmarkEnd w:id="22"/>
+    </w:p>
+    <w:p>
+      <w:r>
+        <w:drawing>
+          <wp:inline distT="0" distB="0" distL="0" distR="0" wp14:anchorId="395C58D5" wp14:editId="460458C5">
+            <wp:extent cx="6120130" cy="4248150"/>
+            <wp:effectExtent l="0" t="0" r="0" b="0"/>
+            <wp:docPr id="960764617" name="Imagen 1" descr="Interfaz de usuario gráfica, Texto&#10;&#10;El contenido generado por IA puede ser incorrecto."/>
+            <wp:cNvGraphicFramePr>
+              <a:graphicFrameLocks xmlns:a="http://schemas.openxmlformats.org/drawingml/2006/main" noChangeAspect="1"/>
+            </wp:cNvGraphicFramePr>
+            <a:graphic xmlns:a="http://schemas.openxmlformats.org/drawingml/2006/main">
+              <a:graphicData uri="http://schemas.openxmlformats.org/drawingml/2006/picture">
+                <pic:pic xmlns:pic="http://schemas.openxmlformats.org/drawingml/2006/picture">
+                  <pic:nvPicPr>
+                    <pic:cNvPr id="960764617" name="Imagen 1" descr="Interfaz de usuario gráfica, Texto&#10;&#10;El contenido generado por IA puede ser incorrecto."/>
+                    <pic:cNvPicPr/>
+                  </pic:nvPicPr>
+                  <pic:blipFill>
+                    <a:blip r:embed="rId19"/>
+                    <a:stretch>
+                      <a:fillRect/>
+                    </a:stretch>
+                  </pic:blipFill>
+                  <pic:spPr>
+                    <a:xfrm>
+                      <a:off x="0" y="0"/>
+                      <a:ext cx="6120130" cy="4248150"/>
+                    </a:xfrm>
+                    <a:prstGeom prst="rect">
+                      <a:avLst/>
+                    </a:prstGeom>
+                  </pic:spPr>
+                </pic:pic>
+              </a:graphicData>
+            </a:graphic>
+          </wp:inline>
+        </w:drawing>
+      </w:r>
+    </w:p>
+    <w:p>
+      <w:pPr>
+        <w:pStyle w:val="Descripcin"/>
+        <w:jc w:val="center"/>
+      </w:pPr>
+      <w:r>
+        <w:t xml:space="preserve">Figura </w:t>
+      </w:r>
+      <w:r>
+        <w:t>5</w:t>
+      </w:r>
+      <w:r>
+        <w:t xml:space="preserve">. </w:t>
+      </w:r>
+      <w:r>
+        <w:t>Interfaz gráfica de Inicio de Sesión</w:t>
+      </w:r>
     </w:p>
     <w:p/>
     <w:p>
@@ -6123,9 +6241,67 @@
       </w:pPr>
       <w:bookmarkStart w:id="23" w:name="_Toc210125382"/>
       <w:r>
+        <w:lastRenderedPageBreak/>
         <w:t>MAPA DE NAVEGABILIDAD</w:t>
       </w:r>
       <w:bookmarkEnd w:id="23"/>
+    </w:p>
+    <w:p>
+      <w:r>
+        <w:drawing>
+          <wp:inline distT="0" distB="0" distL="0" distR="0" wp14:anchorId="45539957" wp14:editId="3D498E8C">
+            <wp:extent cx="6120130" cy="4509135"/>
+            <wp:effectExtent l="0" t="0" r="0" b="5715"/>
+            <wp:docPr id="1743701978" name="Imagen 1" descr="Diagrama&#10;&#10;El contenido generado por IA puede ser incorrecto."/>
+            <wp:cNvGraphicFramePr>
+              <a:graphicFrameLocks xmlns:a="http://schemas.openxmlformats.org/drawingml/2006/main" noChangeAspect="1"/>
+            </wp:cNvGraphicFramePr>
+            <a:graphic xmlns:a="http://schemas.openxmlformats.org/drawingml/2006/main">
+              <a:graphicData uri="http://schemas.openxmlformats.org/drawingml/2006/picture">
+                <pic:pic xmlns:pic="http://schemas.openxmlformats.org/drawingml/2006/picture">
+                  <pic:nvPicPr>
+                    <pic:cNvPr id="1743701978" name="Imagen 1" descr="Diagrama&#10;&#10;El contenido generado por IA puede ser incorrecto."/>
+                    <pic:cNvPicPr/>
+                  </pic:nvPicPr>
+                  <pic:blipFill>
+                    <a:blip r:embed="rId20"/>
+                    <a:stretch>
+                      <a:fillRect/>
+                    </a:stretch>
+                  </pic:blipFill>
+                  <pic:spPr>
+                    <a:xfrm>
+                      <a:off x="0" y="0"/>
+                      <a:ext cx="6120130" cy="4509135"/>
+                    </a:xfrm>
+                    <a:prstGeom prst="rect">
+                      <a:avLst/>
+                    </a:prstGeom>
+                  </pic:spPr>
+                </pic:pic>
+              </a:graphicData>
+            </a:graphic>
+          </wp:inline>
+        </w:drawing>
+      </w:r>
+    </w:p>
+    <w:p>
+      <w:pPr>
+        <w:pStyle w:val="Descripcin"/>
+        <w:jc w:val="center"/>
+      </w:pPr>
+      <w:r>
+        <w:t xml:space="preserve">Figura </w:t>
+      </w:r>
+      <w:r>
+        <w:t>6</w:t>
+      </w:r>
+      <w:r>
+        <w:t xml:space="preserve">. </w:t>
+      </w:r>
+      <w:r>
+        <w:t>Mapa de navegabilidad inicial</w:t>
+      </w:r>
     </w:p>
     <w:p/>
     <w:p>
@@ -6670,7 +6846,7 @@
       </w:r>
     </w:p>
     <w:sectPr>
-      <w:footerReference w:type="default" r:id="rId19"/>
+      <w:footerReference w:type="default" r:id="rId21"/>
       <w:pgSz w:w="11906" w:h="16838"/>
       <w:pgMar w:top="1134" w:right="1134" w:bottom="1418" w:left="1134" w:header="709" w:footer="709" w:gutter="0"/>
       <w:pgNumType w:start="1"/>
@@ -8602,12 +8778,6 @@
 </file>
 
 <file path=customXml/item1.xml><?xml version="1.0" encoding="utf-8"?>
-<p:properties xmlns:p="http://schemas.microsoft.com/office/2006/metadata/properties" xmlns:xsi="http://www.w3.org/2001/XMLSchema-instance" xmlns:pc="http://schemas.microsoft.com/office/infopath/2007/PartnerControls">
-  <documentManagement/>
-</p:properties>
-</file>
-
-<file path=customXml/item2.xml><?xml version="1.0" encoding="utf-8"?>
 <?mso-contentType ?>
 <FormTemplates xmlns="http://schemas.microsoft.com/sharepoint/v3/contenttype/forms">
   <Display>DocumentLibraryForm</Display>
@@ -8616,7 +8786,17 @@
 </FormTemplates>
 </file>
 
+<file path=customXml/item2.xml><?xml version="1.0" encoding="utf-8"?>
+<p:properties xmlns:p="http://schemas.microsoft.com/office/2006/metadata/properties" xmlns:xsi="http://www.w3.org/2001/XMLSchema-instance" xmlns:pc="http://schemas.microsoft.com/office/infopath/2007/PartnerControls">
+  <documentManagement/>
+</p:properties>
+</file>
+
 <file path=customXml/item3.xml><?xml version="1.0" encoding="utf-8"?>
+<b:Sources xmlns:b="http://schemas.openxmlformats.org/officeDocument/2006/bibliography" xmlns="http://schemas.openxmlformats.org/officeDocument/2006/bibliography" SelectedStyle="\APASixthEditionOfficeOnline.xsl" StyleName="APA" Version="6"/>
+</file>
+
+<file path=customXml/item4.xml><?xml version="1.0" encoding="utf-8"?>
 <ct:contentTypeSchema xmlns:ct="http://schemas.microsoft.com/office/2006/metadata/contentType" xmlns:ma="http://schemas.microsoft.com/office/2006/metadata/properties/metaAttributes" ct:_="" ma:_="" ma:contentTypeName="Documento" ma:contentTypeID="0x0101003E64B964EE86E94E88810388061E4AC8" ma:contentTypeVersion="3" ma:contentTypeDescription="Crear nuevo documento." ma:contentTypeScope="" ma:versionID="3c755de4efb81f0959f76dfe4f7a563c">
   <xsd:schema xmlns:xsd="http://www.w3.org/2001/XMLSchema" xmlns:xs="http://www.w3.org/2001/XMLSchema" xmlns:p="http://schemas.microsoft.com/office/2006/metadata/properties" xmlns:ns2="72982a07-b385-426f-8f99-a9bd2486cbec" targetNamespace="http://schemas.microsoft.com/office/2006/metadata/properties" ma:root="true" ma:fieldsID="5f645ab2d71ed821d1fb93c6441734aa" ns2:_="">
     <xsd:import namespace="72982a07-b385-426f-8f99-a9bd2486cbec"/>
@@ -8754,11 +8934,15 @@
 </ct:contentTypeSchema>
 </file>
 
-<file path=customXml/item4.xml><?xml version="1.0" encoding="utf-8"?>
-<b:Sources xmlns:b="http://schemas.openxmlformats.org/officeDocument/2006/bibliography" xmlns="http://schemas.openxmlformats.org/officeDocument/2006/bibliography" SelectedStyle="\APASixthEditionOfficeOnline.xsl" StyleName="APA" Version="6"/>
+<file path=customXml/itemProps1.xml><?xml version="1.0" encoding="utf-8"?>
+<ds:datastoreItem xmlns:ds="http://schemas.openxmlformats.org/officeDocument/2006/customXml" ds:itemID="{480B8420-1B48-4D23-8D6E-64373AC5070B}">
+  <ds:schemaRefs>
+    <ds:schemaRef ds:uri="http://schemas.microsoft.com/sharepoint/v3/contenttype/forms"/>
+  </ds:schemaRefs>
+</ds:datastoreItem>
 </file>
 
-<file path=customXml/itemProps1.xml><?xml version="1.0" encoding="utf-8"?>
+<file path=customXml/itemProps2.xml><?xml version="1.0" encoding="utf-8"?>
 <ds:datastoreItem xmlns:ds="http://schemas.openxmlformats.org/officeDocument/2006/customXml" ds:itemID="{7F0B1298-25D5-45B9-909D-DD837044A49E}">
   <ds:schemaRefs>
     <ds:schemaRef ds:uri="http://schemas.microsoft.com/office/2006/metadata/properties"/>
@@ -8767,15 +8951,15 @@
 </ds:datastoreItem>
 </file>
 
-<file path=customXml/itemProps2.xml><?xml version="1.0" encoding="utf-8"?>
-<ds:datastoreItem xmlns:ds="http://schemas.openxmlformats.org/officeDocument/2006/customXml" ds:itemID="{480B8420-1B48-4D23-8D6E-64373AC5070B}">
+<file path=customXml/itemProps3.xml><?xml version="1.0" encoding="utf-8"?>
+<ds:datastoreItem xmlns:ds="http://schemas.openxmlformats.org/officeDocument/2006/customXml" ds:itemID="{453714F8-FBC3-4DCC-8DCB-89BB58DCF76F}">
   <ds:schemaRefs>
-    <ds:schemaRef ds:uri="http://schemas.microsoft.com/sharepoint/v3/contenttype/forms"/>
+    <ds:schemaRef ds:uri="http://schemas.openxmlformats.org/officeDocument/2006/bibliography"/>
   </ds:schemaRefs>
 </ds:datastoreItem>
 </file>
 
-<file path=customXml/itemProps3.xml><?xml version="1.0" encoding="utf-8"?>
+<file path=customXml/itemProps4.xml><?xml version="1.0" encoding="utf-8"?>
 <ds:datastoreItem xmlns:ds="http://schemas.openxmlformats.org/officeDocument/2006/customXml" ds:itemID="{CAB20FFE-1E23-4B58-9D76-1835AB7D3BED}">
   <ds:schemaRefs>
     <ds:schemaRef ds:uri="http://schemas.microsoft.com/office/2006/metadata/contentType"/>
@@ -8791,12 +8975,4 @@
     <ds:schemaRef ds:uri="http://schemas.microsoft.com/internal/obd"/>
   </ds:schemaRefs>
 </ds:datastoreItem>
-</file>
-
-<file path=customXml/itemProps4.xml><?xml version="1.0" encoding="utf-8"?>
-<ds:datastoreItem xmlns:ds="http://schemas.openxmlformats.org/officeDocument/2006/customXml" ds:itemID="{453714F8-FBC3-4DCC-8DCB-89BB58DCF76F}">
-  <ds:schemaRefs>
-    <ds:schemaRef ds:uri="http://schemas.openxmlformats.org/officeDocument/2006/bibliography"/>
-  </ds:schemaRefs>
-</ds:datastoreItem>
 </file>
</xml_diff>